<commit_message>
Atualiza manual: seção de Produtos com a calculadora automática
A seção 5.3 ainda descrevia o cadastro antigo (custo/preço digitados
à mão) — atualizada pra refletir a calculadora automática adicionada
depois que o manual foi escrito.

Co-Authored-By: Claude Sonnet 5 <noreply@anthropic.com>
</commit_message>
<xml_diff>
--- a/docs/Manual-do-Administrador.docx
+++ b/docs/Manual-do-Administrador.docx
@@ -1140,7 +1140,78 @@
         <w:spacing w:after="150"/>
       </w:pPr>
       <w:r>
-        <w:t xml:space="preserve">Cadastre as peças que você já imprime com frequência (ex: "Suporte de celular"), com peso médio e tempo médio de impressão. Ao montar um orçamento, escolher o produto do catálogo já pré-preenche esses dois campos, economizando tempo.</w:t>
+        <w:t xml:space="preserve">Cadastre as peças que você já imprime com frequência (ex: "Suporte de celular"). Ao montar um orçamento, escolher o produto do catálogo já pré-preenche peso e tempo de impressão, economizando tempo.</w:t>
+      </w:r>
+    </w:p>
+    <w:p>
+      <w:pPr>
+        <w:spacing w:after="150"/>
+      </w:pPr>
+      <w:r>
+        <w:t xml:space="preserve">O cadastro de produto tem sua própria calculadora, igual à de Orçamentos: informe o peso e tempo médios, escolha o insumo de estoque (filamento) e a impressora usada, e o sistema calcula sozinho:</w:t>
+      </w:r>
+    </w:p>
+    <w:p>
+      <w:pPr>
+        <w:pStyle w:val="ListParagraph"/>
+        <w:numPr>
+          <w:ilvl w:val="0"/>
+          <w:numId w:val="2"/>
+        </w:numPr>
+        <w:spacing w:after="80"/>
+      </w:pPr>
+      <w:r>
+        <w:rPr>
+          <w:b/>
+          <w:bCs/>
+        </w:rPr>
+        <w:t xml:space="preserve">Custo médio — </w:t>
+      </w:r>
+      <w:r>
+        <w:t xml:space="preserve">soma de material, energia, depreciação da máquina e mão de obra.</w:t>
+      </w:r>
+    </w:p>
+    <w:p>
+      <w:pPr>
+        <w:pStyle w:val="ListParagraph"/>
+        <w:numPr>
+          <w:ilvl w:val="0"/>
+          <w:numId w:val="2"/>
+        </w:numPr>
+        <w:spacing w:after="80"/>
+      </w:pPr>
+      <w:r>
+        <w:rPr>
+          <w:b/>
+          <w:bCs/>
+        </w:rPr>
+        <w:t xml:space="preserve">Preço sugerido — </w:t>
+      </w:r>
+      <w:r>
+        <w:t xml:space="preserve">o custo médio já com a margem de lucro aplicada.</w:t>
+      </w:r>
+    </w:p>
+    <w:p>
+      <w:pPr>
+        <w:pBdr>
+          <w:left w:val="single" w:color="6D4CE0" w:sz="12" w:space="8"/>
+        </w:pBdr>
+        <w:spacing w:after="200" w:before="100"/>
+        <w:ind w:left="200"/>
+      </w:pPr>
+      <w:r>
+        <w:rPr>
+          <w:b/>
+          <w:bCs/>
+          <w:color w:val="3D2E8C"/>
+        </w:rPr>
+        <w:t xml:space="preserve">Dica: </w:t>
+      </w:r>
+      <w:r>
+        <w:rPr>
+          <w:color w:val="444444"/>
+        </w:rPr>
+        <w:t xml:space="preserve">Custo médio e Preço sugerido são sempre calculados, não digitados à mão — pra mudar o preço sugerido, ajuste a Margem sugerida (%) ou os campos que alimentam o cálculo.</w:t>
       </w:r>
     </w:p>
     <w:p>

</xml_diff>

<commit_message>
Atualiza manual: insumos adicionais, aviso de estoque e Recomendações
Documenta três coisas adicionadas depois da última atualização: o
botão "Adicionar insumo" para impressão colorida/multimaterial, o
aviso de estoque insuficiente na hora de montar o item, e o novo
módulo de Recomendações.

Co-Authored-By: Claude Sonnet 5 <noreply@anthropic.com>
</commit_message>
<xml_diff>
--- a/docs/Manual-do-Administrador.docx
+++ b/docs/Manual-do-Administrador.docx
@@ -936,6 +936,54 @@
                 <w:sz w:val="20"/>
                 <w:szCs w:val="20"/>
               </w:rPr>
+              <w:t xml:space="preserve">Recomendações</w:t>
+            </w:r>
+          </w:p>
+        </w:tc>
+        <w:tc>
+          <w:tcPr>
+            <w:tcW w:type="dxa" w:w="6800"/>
+            <w:tcMar>
+              <w:top w:type="dxa" w:w="80"/>
+              <w:left w:type="dxa" w:w="100"/>
+              <w:bottom w:type="dxa" w:w="80"/>
+              <w:right w:type="dxa" w:w="100"/>
+            </w:tcMar>
+          </w:tcPr>
+          <w:p>
+            <w:r>
+              <w:rPr>
+                <w:b w:val="false"/>
+                <w:bCs w:val="false"/>
+                <w:color w:val="222222"/>
+                <w:sz w:val="20"/>
+                <w:szCs w:val="20"/>
+              </w:rPr>
+              <w:t xml:space="preserve">Insights automáticos sobre vendas, preços, produção e estoque. (Só Administrador)</w:t>
+            </w:r>
+          </w:p>
+        </w:tc>
+      </w:tr>
+      <w:tr>
+        <w:tc>
+          <w:tcPr>
+            <w:tcW w:type="dxa" w:w="2200"/>
+            <w:tcMar>
+              <w:top w:type="dxa" w:w="80"/>
+              <w:left w:type="dxa" w:w="100"/>
+              <w:bottom w:type="dxa" w:w="80"/>
+              <w:right w:type="dxa" w:w="100"/>
+            </w:tcMar>
+          </w:tcPr>
+          <w:p>
+            <w:r>
+              <w:rPr>
+                <w:b w:val="false"/>
+                <w:bCs w:val="false"/>
+                <w:color w:val="222222"/>
+                <w:sz w:val="20"/>
+                <w:szCs w:val="20"/>
+              </w:rPr>
               <w:t xml:space="preserve">Configurações</w:t>
             </w:r>
           </w:p>
@@ -1349,7 +1397,7 @@
                 <w:sz w:val="20"/>
                 <w:szCs w:val="20"/>
               </w:rPr>
-              <w:t xml:space="preserve">O rolo de filamento (ou resina) que você vai usar. Ao escolher, o preço do material já é preenchido automaticamente.</w:t>
+              <w:t xml:space="preserve">O rolo de filamento (ou resina) que você vai usar. Ao escolher, o preço do material já é preenchido automaticamente. Se a quantidade necessária passar do que tem disponível, aparece um aviso vermelho na hora.</w:t>
             </w:r>
           </w:p>
         </w:tc>
@@ -2379,6 +2427,29 @@
         <w:rPr>
           <w:color w:val="444444"/>
         </w:rPr>
+        <w:t xml:space="preserve">Peça em mais de uma cor ou material? Clique em "Adicionar insumo" (abaixo do bloco de Material) pra somar quantos filamentos extras precisar, cada um com seu próprio peso em gramas — o custo e a baixa de estoque consideram todos eles.</w:t>
+      </w:r>
+    </w:p>
+    <w:p>
+      <w:pPr>
+        <w:pBdr>
+          <w:left w:val="single" w:color="6D4CE0" w:sz="12" w:space="8"/>
+        </w:pBdr>
+        <w:spacing w:after="200" w:before="100"/>
+        <w:ind w:left="200"/>
+      </w:pPr>
+      <w:r>
+        <w:rPr>
+          <w:b/>
+          <w:bCs/>
+          <w:color w:val="3D2E8C"/>
+        </w:rPr>
+        <w:t xml:space="preserve">Dica: </w:t>
+      </w:r>
+      <w:r>
+        <w:rPr>
+          <w:color w:val="444444"/>
+        </w:rPr>
         <w:t xml:space="preserve">Todos os campos com o ícone de "?" ao lado do nome mostram uma explicação se você passar o mouse por cima.</w:t>
       </w:r>
     </w:p>
@@ -2756,6 +2827,46 @@
       </w:pPr>
       <w:r>
         <w:t xml:space="preserve">Backup do banco: baixa um arquivo com todos os dados do sistema, como registro de segurança.</w:t>
+      </w:r>
+    </w:p>
+    <w:p>
+      <w:pPr>
+        <w:pStyle w:val="Heading2"/>
+        <w:spacing w:after="150" w:before="300"/>
+      </w:pPr>
+      <w:r>
+        <w:t xml:space="preserve">5.14 Recomendações</w:t>
+      </w:r>
+    </w:p>
+    <w:p>
+      <w:pPr>
+        <w:spacing w:after="150"/>
+      </w:pPr>
+      <w:r>
+        <w:t xml:space="preserve">Só o Administrador acessa. Analisa os dados reais do seu sistema — vendas por peça, margem real, taxa de falha por impressora, pedidos atrasados, estoque de filamento e clientes que pararam de comprar — e mostra insights em português simples, como "essa peça está com margem baixa, considere reajustar o preço" ou "esse cliente não compra há X dias".</w:t>
+      </w:r>
+    </w:p>
+    <w:p>
+      <w:pPr>
+        <w:pBdr>
+          <w:left w:val="single" w:color="6D4CE0" w:sz="12" w:space="8"/>
+        </w:pBdr>
+        <w:spacing w:after="200" w:before="100"/>
+        <w:ind w:left="200"/>
+      </w:pPr>
+      <w:r>
+        <w:rPr>
+          <w:b/>
+          <w:bCs/>
+          <w:color w:val="3D2E8C"/>
+        </w:rPr>
+        <w:t xml:space="preserve">Dica: </w:t>
+      </w:r>
+      <w:r>
+        <w:rPr>
+          <w:color w:val="444444"/>
+        </w:rPr>
+        <w:t xml:space="preserve">As recomendações são baseadas em regras sobre os seus próprios dados, não em suposições — quanto mais pedidos o sistema tiver registrado, mais recomendações relevantes vão aparecer.</w:t>
       </w:r>
     </w:p>
     <w:p>

</xml_diff>